<commit_message>
Ampliar memoria: hallazgos con figuras, aplicación y limitaciones/trabajo futuro
</commit_message>
<xml_diff>
--- a/memoria/Diego_Abella_TFM_memoria.docx
+++ b/memoria/Diego_Abella_TFM_memoria.docx
@@ -3130,42 +3130,486 @@
       </w:pPr>
       <w:r>
         <w:rPr>
+          <w:b/>
+          <w:lang w:val="es-ES"/>
+        </w:rPr>
+        <w:t>Página 1: explorar el voto territorial.</w:t>
+      </w:r>
+      <w:r>
+        <w:rPr>
+          <w:lang w:val="es-ES"/>
+        </w:rPr>
+        <w:t xml:space="preserve"> La primera es un explorador general del voto, que trae un mapa de Colombia coloreado por el porcentaje de voto de izquierda de cada municipio, con un selector para cambiar de año y ver cómo se transforma el mapa entre 2006 y 2022. La página se organiza en cuatro pestañas: mapa por municipio, evolución nacional del voto a lo largo del tiempo, inercia electoral —un gráfico que muestra cómo el voto de cada municipio se parece al que tuvo en la elección anterior, que es la evidencia visual del hallazgo más importante—, y la relación entre pobreza y voto que cambia de signo según la región, que es el hallazgo de la falacia ecológica hecho visual. Esta es la página para quien quiere hacerse una idea del panorama de datos analizados a nivel nacional.</w:t>
+      </w:r>
+    </w:p>
+    <w:p>
+      <w:pPr>
+        <w:spacing w:after="160" w:line="276" w:lineRule="auto"/>
+        <w:jc w:val="both"/>
+        <w:rPr>
+          <w:lang w:val="es-ES"/>
+        </w:rPr>
+      </w:pPr>
+      <w:r>
+        <w:rPr>
+          <w:b/>
+          <w:lang w:val="es-ES"/>
+        </w:rPr>
+        <w:t>Página 2: consultar un municipio.</w:t>
+      </w:r>
+      <w:r>
+        <w:rPr>
+          <w:lang w:val="es-ES"/>
+        </w:rPr>
+        <w:t xml:space="preserve"> La segunda deja consultar por un municipio concreto, donde se elige el municipio y el año, y la aplicación muestra cómo votó de verdad, cuánto predecía el modelo a partir de su historia, su perfil de voto, y la diferencia entre ambos. Un indicador de color avisa si el municipio siguió su tendencia o si se desvió de forma notable, con una frase en lenguaje sencillo que traduce el resultado. Esta es la parte que convierte el modelo en algo consultable caso por caso.</w:t>
+      </w:r>
+    </w:p>
+    <w:p>
+      <w:pPr>
+        <w:spacing w:after="160" w:line="276" w:lineRule="auto"/>
+        <w:jc w:val="both"/>
+        <w:rPr>
+          <w:lang w:val="es-ES"/>
+        </w:rPr>
+      </w:pPr>
+      <w:r>
+        <w:rPr>
+          <w:b/>
+          <w:lang w:val="es-ES"/>
+        </w:rPr>
+        <w:t>Página 3: municipios que rompen su tendencia</w:t>
+      </w:r>
+      <w:r>
+        <w:rPr>
+          <w:b/>
+          <w:lang w:val="es-ES"/>
+        </w:rPr>
+        <w:t>.</w:t>
+      </w:r>
+      <w:r>
+        <w:rPr>
+          <w:lang w:val="es-ES"/>
+        </w:rPr>
+        <w:t xml:space="preserve"> La tercera muestra en un mapa los municipios que más se alejaron de lo que su historia predecía en 2022, que son los residuos del modelo</w:t>
+      </w:r>
+      <w:r>
+        <w:rPr>
+          <w:lang w:val="es-ES"/>
+        </w:rPr>
+        <w:t xml:space="preserve">, incluyendo </w:t>
+      </w:r>
+      <w:r>
+        <w:rPr>
+          <w:lang w:val="es-ES"/>
+        </w:rPr>
+        <w:t xml:space="preserve">una tabla con los veinte municipios de mayor desviación. </w:t>
+      </w:r>
+      <w:r>
+        <w:rPr>
+          <w:lang w:val="es-ES"/>
+        </w:rPr>
+        <w:t>Esta p</w:t>
+      </w:r>
+      <w:r>
+        <w:rPr>
+          <w:lang w:val="es-ES"/>
+        </w:rPr>
+        <w:t>ágina incluye una advertencia visible sobre cómo leer esos residuos: son municipios que se apartan de su propia trayectoria</w:t>
+      </w:r>
+      <w:r>
+        <w:rPr>
+          <w:lang w:val="es-ES"/>
+        </w:rPr>
+        <w:t xml:space="preserve"> y </w:t>
+      </w:r>
+      <w:r>
+        <w:rPr>
+          <w:lang w:val="es-ES"/>
+        </w:rPr>
+        <w:t xml:space="preserve">no </w:t>
+      </w:r>
+      <w:r>
+        <w:rPr>
+          <w:lang w:val="es-ES"/>
+        </w:rPr>
+        <w:t xml:space="preserve">son </w:t>
+      </w:r>
+      <w:r>
+        <w:rPr>
+          <w:lang w:val="es-ES"/>
+        </w:rPr>
+        <w:t>indicios de irregularidad.</w:t>
+      </w:r>
+      <w:r>
+        <w:rPr>
+          <w:lang w:val="es-ES"/>
+        </w:rPr>
+        <w:t xml:space="preserve"> </w:t>
+      </w:r>
+      <w:r>
+        <w:rPr>
+          <w:lang w:val="es-ES"/>
+        </w:rPr>
+        <w:t>Además, los municipios con muy pocos votos quedan filtrados para que no aparezcan como falsas alarmas.</w:t>
+      </w:r>
+    </w:p>
+    <w:p>
+      <w:pPr>
+        <w:spacing w:after="160" w:line="276" w:lineRule="auto"/>
+        <w:jc w:val="both"/>
+        <w:rPr>
+          <w:lang w:val="es-ES"/>
+        </w:rPr>
+      </w:pPr>
+      <w:r>
+        <w:rPr>
+          <w:lang w:val="es-ES"/>
+        </w:rPr>
+        <w:t xml:space="preserve">Una decisión importante de la aplicación es que no calcula nada en caliente: se apoya en datos que ya vienen procesados desde el análisis. Eso la hace rápida y estable, sin depender </w:t>
+      </w:r>
+      <w:r>
+        <w:rPr>
+          <w:lang w:val="es-ES"/>
+        </w:rPr>
+        <w:lastRenderedPageBreak/>
+        <w:t xml:space="preserve">de cargar un modelo pesado cada vez que alguien la abre. En </w:t>
+      </w:r>
+      <w:r>
+        <w:rPr>
+          <w:lang w:val="es-ES"/>
+        </w:rPr>
+        <w:t>otras palabras</w:t>
+      </w:r>
+      <w:r>
+        <w:rPr>
+          <w:lang w:val="es-ES"/>
+        </w:rPr>
+        <w:t xml:space="preserve">, es la forma más directa de tomar todo lo que encontré y ponerlo </w:t>
+      </w:r>
+      <w:r>
+        <w:rPr>
+          <w:lang w:val="es-ES"/>
+        </w:rPr>
+        <w:t xml:space="preserve">de forma visual fácilmente </w:t>
+      </w:r>
+      <w:r>
+        <w:rPr>
+          <w:lang w:val="es-ES"/>
+        </w:rPr>
+        <w:t>interpretable</w:t>
+      </w:r>
+      <w:r>
+        <w:rPr>
+          <w:lang w:val="es-ES"/>
+        </w:rPr>
+        <w:t xml:space="preserve"> para que cualquier usuario que no conozca mucho del contexto del proyecto, pueda </w:t>
+      </w:r>
+      <w:r>
+        <w:rPr>
+          <w:lang w:val="es-ES"/>
+        </w:rPr>
+        <w:t>explorarlo</w:t>
+      </w:r>
+      <w:r>
+        <w:rPr>
+          <w:lang w:val="es-ES"/>
+        </w:rPr>
+        <w:t xml:space="preserve"> y entenderlo</w:t>
+      </w:r>
+      <w:r>
+        <w:rPr>
+          <w:lang w:val="es-ES"/>
+        </w:rPr>
+        <w:t>.</w:t>
+      </w:r>
+    </w:p>
+    <w:p>
+      <w:pPr>
+        <w:pStyle w:val="Heading1"/>
+        <w:spacing w:before="240" w:after="160"/>
+        <w:rPr>
+          <w:lang w:val="es-ES"/>
+        </w:rPr>
+      </w:pPr>
+      <w:r>
+        <w:rPr>
+          <w:lang w:val="es-ES"/>
+        </w:rPr>
+        <w:t>Limitaciones y trabajo futuro</w:t>
+      </w:r>
+    </w:p>
+    <w:p>
+      <w:pPr>
+        <w:spacing w:after="160" w:line="276" w:lineRule="auto"/>
+        <w:jc w:val="both"/>
+        <w:rPr>
+          <w:lang w:val="es-ES"/>
+        </w:rPr>
+      </w:pPr>
+      <w:r>
+        <w:rPr>
+          <w:rFonts w:ascii="Arial" w:hAnsi="Arial"/>
+          <w:sz w:val="22"/>
+        </w:rPr>
+        <w:t>Estas son las principales limitantes que he identificado mientras realizaba este trabajo:</w:t>
+      </w:r>
+    </w:p>
+    <w:p>
+      <w:pPr>
+        <w:spacing w:after="160" w:line="276" w:lineRule="auto"/>
+        <w:jc w:val="both"/>
+        <w:rPr>
+          <w:lang w:val="es-ES"/>
+        </w:rPr>
+      </w:pPr>
+      <w:r>
+        <w:rPr>
+          <w:b/>
+          <w:lang w:val="es-ES"/>
+        </w:rPr>
+        <w:t>El más importante es que trabajo con territorios, no con personas.</w:t>
+      </w:r>
+      <w:r>
+        <w:rPr>
+          <w:lang w:val="es-ES"/>
+        </w:rPr>
+        <w:t xml:space="preserve"> </w:t>
+      </w:r>
+      <w:r>
+        <w:rPr>
+          <w:lang w:val="es-ES"/>
+        </w:rPr>
+        <w:t xml:space="preserve">Los datos con los que he trabajado </w:t>
+      </w:r>
+      <w:r>
+        <w:rPr>
+          <w:lang w:val="es-ES"/>
+        </w:rPr>
+        <w:t xml:space="preserve">son patrones de municipios, no de votantes individuales. </w:t>
+      </w:r>
+      <w:r>
+        <w:rPr>
+          <w:lang w:val="es-ES"/>
+        </w:rPr>
+        <w:t>El hecho de q</w:t>
+      </w:r>
+      <w:r>
+        <w:rPr>
+          <w:lang w:val="es-ES"/>
+        </w:rPr>
+        <w:t>ue un municipio pobre vote de cierta forma no significa que sean los pobres de ese municipio los que votan así</w:t>
+      </w:r>
+      <w:r>
+        <w:rPr>
+          <w:lang w:val="es-ES"/>
+        </w:rPr>
+        <w:t xml:space="preserve">, </w:t>
+      </w:r>
+      <w:r>
+        <w:rPr>
+          <w:lang w:val="es-ES"/>
+        </w:rPr>
+        <w:t>podría ser al revés</w:t>
+      </w:r>
+      <w:r>
+        <w:rPr>
+          <w:lang w:val="es-ES"/>
+        </w:rPr>
+        <w:t xml:space="preserve"> por lo que s</w:t>
+      </w:r>
+      <w:r>
+        <w:rPr>
+          <w:lang w:val="es-ES"/>
+        </w:rPr>
+        <w:t>acar conclusiones sobre individuos a partir de datos agregados es un error conocido (la falacia ecológica), y este trabajo se cuida de no cometerlo</w:t>
+      </w:r>
+      <w:r>
+        <w:rPr>
+          <w:lang w:val="es-ES"/>
+        </w:rPr>
+        <w:t>, así que por eso h</w:t>
+      </w:r>
+      <w:r>
+        <w:rPr>
+          <w:lang w:val="es-ES"/>
+        </w:rPr>
+        <w:t>abl</w:t>
+      </w:r>
+      <w:r>
+        <w:rPr>
+          <w:lang w:val="es-ES"/>
+        </w:rPr>
+        <w:t xml:space="preserve">amos </w:t>
+      </w:r>
+      <w:r>
+        <w:rPr>
+          <w:lang w:val="es-ES"/>
+        </w:rPr>
+        <w:t>siempre de municipios, nunca de personas.</w:t>
+      </w:r>
+    </w:p>
+    <w:p>
+      <w:pPr>
+        <w:spacing w:after="160" w:line="276" w:lineRule="auto"/>
+        <w:jc w:val="both"/>
+        <w:rPr>
+          <w:lang w:val="es-ES"/>
+        </w:rPr>
+      </w:pPr>
+      <w:r>
+        <w:rPr>
+          <w:b/>
+          <w:lang w:val="es-ES"/>
+        </w:rPr>
+        <w:t>El dato de conflicto es departamental, no municipal.</w:t>
+      </w:r>
+      <w:r>
+        <w:rPr>
+          <w:lang w:val="es-ES"/>
+        </w:rPr>
+        <w:t xml:space="preserve"> Es la limitación que más pesa sobre el hallazgo 4. Como no existe públicamente un registro de víctimas del conflicto a nivel de municipio, cada municipio hereda el valor de su departamento. Eso vuelve el dato grueso y hace que se confunda con la región, como expliqué antes. Un dato de conflicto municipal, más fino, permitiría poner a prueba de verdad si el conflicto tiene un efecto propio</w:t>
+      </w:r>
+      <w:r>
+        <w:rPr>
+          <w:lang w:val="es-ES"/>
+        </w:rPr>
+        <w:t xml:space="preserve"> sobre todo en aquellos donde hay sospecha de que hay cohesión electoral</w:t>
+      </w:r>
+      <w:r>
+        <w:rPr>
+          <w:lang w:val="es-ES"/>
+        </w:rPr>
+        <w:t>; con lo</w:t>
+      </w:r>
+      <w:r>
+        <w:rPr>
+          <w:lang w:val="es-ES"/>
+        </w:rPr>
+        <w:t xml:space="preserve">s datos </w:t>
+      </w:r>
+      <w:r>
+        <w:rPr>
+          <w:lang w:val="es-ES"/>
+        </w:rPr>
+        <w:t>que hay hoy, no se puede</w:t>
+      </w:r>
+      <w:r>
+        <w:rPr>
+          <w:lang w:val="es-ES"/>
+        </w:rPr>
+        <w:t xml:space="preserve"> concluir al respecto</w:t>
+      </w:r>
+      <w:r>
+        <w:rPr>
+          <w:lang w:val="es-ES"/>
+        </w:rPr>
+        <w:t>.</w:t>
+      </w:r>
+    </w:p>
+    <w:p>
+      <w:pPr>
+        <w:spacing w:after="160" w:line="276" w:lineRule="auto"/>
+        <w:jc w:val="both"/>
+        <w:rPr>
+          <w:lang w:val="es-ES"/>
+        </w:rPr>
+      </w:pPr>
+      <w:r>
+        <w:rPr>
           <w:rFonts w:ascii="Arial" w:hAnsi="Arial"/>
           <w:b/>
           <w:sz w:val="22"/>
         </w:rPr>
-        <w:t>Página 1: explorar el voto territorial.</w:t>
+        <w:t>La pobreza se mide con censos, que no son anuales.</w:t>
       </w:r>
       <w:r>
         <w:rPr>
           <w:rFonts w:ascii="Arial" w:hAnsi="Arial"/>
           <w:sz w:val="22"/>
         </w:rPr>
-        <w:t xml:space="preserve"> La primera es un explorador general del voto, que trae un mapa de Colombia coloreado por el porcentaje de voto de izquierda de cada municipio, con un selector para cambiar de año y ver cómo se transforma el mapa entre 2006 y 2022. La página se organiza en cuatro pestañas: mapa por municipio, evolución nacional del voto a lo largo del tiempo, inercia electoral —un gráfico que muestra cómo el voto de cada municipio se parece al que tuvo en la elección anterior, que es la evidencia visual del hallazgo más importante—, y la relación entre pobreza y voto que cambia de signo según la región, que es el hallazgo de la falacia ecológica hecho visual. Esta es la página para quien quiere hacerse una idea del panorama de datos analizados a nivel nacional.</w:t>
-      </w:r>
-    </w:p>
-    <w:p>
-      <w:pPr>
-        <w:spacing w:after="160" w:line="276" w:lineRule="auto"/>
-        <w:jc w:val="both"/>
-        <w:rPr>
-          <w:lang w:val="es-ES"/>
-        </w:rPr>
-      </w:pPr>
-      <w:r>
-        <w:rPr>
-          <w:rFonts w:ascii="Arial" w:hAnsi="Arial"/>
+        <w:t xml:space="preserve"> El NBI (Índice de Necesidades Básicas Insatisfechas) viene de los censos nacionales de 2005 y 2018, así que para varias elecciones uso el dato censal más cercano, no el del año exacto. La pobreza estructural cambia despacio, así que la aproximación es razonable, pero no deja de ser una aproximación.</w:t>
+      </w:r>
+    </w:p>
+    <w:p>
+      <w:pPr>
+        <w:spacing w:after="160" w:line="276" w:lineRule="auto"/>
+        <w:jc w:val="both"/>
+        <w:rPr>
+          <w:lang w:val="es-ES"/>
+        </w:rPr>
+      </w:pPr>
+      <w:r>
+        <w:rPr>
           <w:b/>
-          <w:sz w:val="22"/>
-        </w:rPr>
-        <w:t>Página 2: consultar un municipio.</w:t>
-      </w:r>
-      <w:r>
-        <w:rPr>
-          <w:rFonts w:ascii="Arial" w:hAnsi="Arial"/>
-          <w:sz w:val="22"/>
-        </w:rPr>
-        <w:t xml:space="preserve"> La segunda deja consultar por un municipio concreto, donde se elige el municipio y el año, y la aplicación muestra cómo votó de verdad, cuánto predecía el modelo a partir de su historia, su perfil de voto, y la diferencia entre ambos. Un indicador de color avisa si el municipio siguió su tendencia o si se desvió de forma notable, con una frase en lenguaje sencillo que traduce el resultado. Esta es la parte que convierte el modelo en algo consultable caso por caso.</w:t>
+          <w:lang w:val="es-ES"/>
+        </w:rPr>
+        <w:t>El análisis es correlacional, no causal.</w:t>
+      </w:r>
+      <w:r>
+        <w:rPr>
+          <w:lang w:val="es-ES"/>
+        </w:rPr>
+        <w:t xml:space="preserve"> E</w:t>
+      </w:r>
+      <w:r>
+        <w:rPr>
+          <w:lang w:val="es-ES"/>
+        </w:rPr>
+        <w:t>n mi análisis e</w:t>
+      </w:r>
+      <w:r>
+        <w:rPr>
+          <w:lang w:val="es-ES"/>
+        </w:rPr>
+        <w:t xml:space="preserve">ncuentro que ciertas cosas van juntas </w:t>
+      </w:r>
+      <w:r>
+        <w:rPr>
+          <w:lang w:val="es-ES"/>
+        </w:rPr>
+        <w:t xml:space="preserve">como son por ejemplo </w:t>
+      </w:r>
+      <w:r>
+        <w:rPr>
+          <w:lang w:val="es-ES"/>
+        </w:rPr>
+        <w:t xml:space="preserve">la geografía y el voto, pero no puedo afirmar que una cause la otra. </w:t>
+      </w:r>
+      <w:r>
+        <w:rPr>
+          <w:lang w:val="es-ES"/>
+        </w:rPr>
+        <w:t>Además,</w:t>
+      </w:r>
+      <w:r>
+        <w:rPr>
+          <w:lang w:val="es-ES"/>
+        </w:rPr>
+        <w:t xml:space="preserve"> los residuos son </w:t>
+      </w:r>
+      <w:r>
+        <w:rPr>
+          <w:lang w:val="es-ES"/>
+        </w:rPr>
+        <w:t xml:space="preserve">en particular </w:t>
+      </w:r>
+      <w:r>
+        <w:rPr>
+          <w:lang w:val="es-ES"/>
+        </w:rPr>
+        <w:t xml:space="preserve">una señal de que un municipio se desvió de su tendencia, no una explicación de por qué lo </w:t>
+      </w:r>
+      <w:r>
+        <w:rPr>
+          <w:lang w:val="es-ES"/>
+        </w:rPr>
+        <w:t>he hecho</w:t>
+      </w:r>
+      <w:r>
+        <w:rPr>
+          <w:lang w:val="es-ES"/>
+        </w:rPr>
+        <w:t>.</w:t>
       </w:r>
     </w:p>
     <w:p>
@@ -3181,68 +3625,14 @@
           <w:b/>
           <w:lang w:val="es-ES"/>
         </w:rPr>
-        <w:t>Página 3: municipios que rompen su tendencia</w:t>
+        <w:t xml:space="preserve">Se evalúan </w:t>
       </w:r>
       <w:r>
         <w:rPr>
           <w:b/>
           <w:lang w:val="es-ES"/>
         </w:rPr>
-        <w:t>.</w:t>
-      </w:r>
-      <w:r>
-        <w:rPr>
-          <w:lang w:val="es-ES"/>
-        </w:rPr>
-        <w:t xml:space="preserve"> La tercera muestra en un mapa los municipios que más se alejaron de lo que su historia predecía en 2022, que son los residuos del modelo</w:t>
-      </w:r>
-      <w:r>
-        <w:rPr>
-          <w:lang w:val="es-ES"/>
-        </w:rPr>
-        <w:t xml:space="preserve">, incluyendo </w:t>
-      </w:r>
-      <w:r>
-        <w:rPr>
-          <w:lang w:val="es-ES"/>
-        </w:rPr>
-        <w:t xml:space="preserve">una tabla con los veinte municipios de mayor desviación. </w:t>
-      </w:r>
-      <w:r>
-        <w:rPr>
-          <w:lang w:val="es-ES"/>
-        </w:rPr>
-        <w:t>Esta p</w:t>
-      </w:r>
-      <w:r>
-        <w:rPr>
-          <w:lang w:val="es-ES"/>
-        </w:rPr>
-        <w:t>ágina incluye una advertencia visible sobre cómo leer esos residuos: son municipios que se apartan de su propia trayectoria</w:t>
-      </w:r>
-      <w:r>
-        <w:rPr>
-          <w:lang w:val="es-ES"/>
-        </w:rPr>
-        <w:t xml:space="preserve"> y </w:t>
-      </w:r>
-      <w:r>
-        <w:rPr>
-          <w:lang w:val="es-ES"/>
-        </w:rPr>
-        <w:t xml:space="preserve">no </w:t>
-      </w:r>
-      <w:r>
-        <w:rPr>
-          <w:lang w:val="es-ES"/>
-        </w:rPr>
-        <w:t xml:space="preserve">son </w:t>
-      </w:r>
-      <w:r>
-        <w:rPr>
-          <w:lang w:val="es-ES"/>
-        </w:rPr>
-        <w:t>indicios de irregularidad.</w:t>
+        <w:t>pocas elecciones.</w:t>
       </w:r>
       <w:r>
         <w:rPr>
@@ -3254,77 +3644,274 @@
         <w:rPr>
           <w:lang w:val="es-ES"/>
         </w:rPr>
-        <w:t>Además, los municipios con muy pocos votos quedan filtrados para que no aparezcan como falsas alarmas.</w:t>
-      </w:r>
-    </w:p>
-    <w:p>
-      <w:pPr>
-        <w:spacing w:after="160" w:line="276" w:lineRule="auto"/>
-        <w:jc w:val="both"/>
-        <w:rPr>
-          <w:lang w:val="es-ES"/>
-        </w:rPr>
-      </w:pPr>
-      <w:r>
-        <w:rPr>
-          <w:lang w:val="es-ES"/>
-        </w:rPr>
-        <w:t xml:space="preserve">Una decisión importante de la aplicación es que no calcula nada en caliente: se apoya en datos que ya vienen procesados desde el análisis. Eso la hace rápida y estable, sin depender </w:t>
+        <w:t>Por ausencia de datos oficiales disponibles, s</w:t>
+      </w:r>
+      <w:r>
+        <w:rPr>
+          <w:lang w:val="es-ES"/>
+        </w:rPr>
+        <w:t xml:space="preserve">on cinco elecciones presidenciales </w:t>
+      </w:r>
+      <w:r>
+        <w:rPr>
+          <w:lang w:val="es-ES"/>
+        </w:rPr>
+        <w:t xml:space="preserve">las que </w:t>
+      </w:r>
+      <w:r>
+        <w:rPr>
+          <w:lang w:val="es-ES"/>
+        </w:rPr>
+        <w:t xml:space="preserve">analizo (2006 a 2022). Es suficiente para ver patrones, pero es </w:t>
+      </w:r>
+      <w:r>
+        <w:rPr>
+          <w:lang w:val="es-ES"/>
+        </w:rPr>
+        <w:t xml:space="preserve">una muestra pequeña, por lo que </w:t>
+      </w:r>
+      <w:r>
+        <w:rPr>
+          <w:lang w:val="es-ES"/>
+        </w:rPr>
+        <w:t xml:space="preserve">cosas como el vuelco de 2010 pesan mucho cuando se tienen tan pocos puntos </w:t>
+      </w:r>
+      <w:r>
+        <w:rPr>
+          <w:lang w:val="es-ES"/>
+        </w:rPr>
+        <w:t>de referencia e</w:t>
+      </w:r>
+      <w:r>
+        <w:rPr>
+          <w:lang w:val="es-ES"/>
+        </w:rPr>
+        <w:t>n el tiempo.</w:t>
+      </w:r>
+    </w:p>
+    <w:p>
+      <w:pPr>
+        <w:spacing w:after="160" w:line="276" w:lineRule="auto"/>
+        <w:jc w:val="both"/>
+        <w:rPr>
+          <w:lang w:val="es-ES"/>
+        </w:rPr>
+      </w:pPr>
+      <w:r>
+        <w:rPr>
+          <w:b/>
+          <w:lang w:val="es-ES"/>
+        </w:rPr>
+        <w:t>El sistema de partidos cambió mucho en estos años.</w:t>
+      </w:r>
+      <w:r>
+        <w:rPr>
+          <w:lang w:val="es-ES"/>
+        </w:rPr>
+        <w:t xml:space="preserve"> La línea de izquierda que sigo pasó por tres nombres distintos (Polo, Colombia Humana, Pacto Histórico) y el país de 2006 no es el de 2022. </w:t>
+      </w:r>
+    </w:p>
+    <w:p>
+      <w:pPr>
+        <w:spacing w:after="160" w:line="276" w:lineRule="auto"/>
+        <w:jc w:val="both"/>
+        <w:rPr>
+          <w:lang w:val="es-ES"/>
+        </w:rPr>
+      </w:pPr>
+      <w:r>
+        <w:rPr>
+          <w:b/>
+          <w:lang w:val="es-ES"/>
+        </w:rPr>
+        <w:t>Los municipios muy pequeños quedan fuera del alcance fiable.</w:t>
+      </w:r>
+      <w:r>
+        <w:rPr>
+          <w:lang w:val="es-ES"/>
+        </w:rPr>
+        <w:t xml:space="preserve"> En municipios con muy pocos votos (algunos de </w:t>
+      </w:r>
+      <w:r>
+        <w:rPr>
+          <w:lang w:val="es-ES"/>
+        </w:rPr>
+        <w:t xml:space="preserve">departamentos como </w:t>
+      </w:r>
+      <w:r>
+        <w:rPr>
+          <w:lang w:val="es-ES"/>
+        </w:rPr>
+        <w:t>Guainía, Vaupés o Amazonas, con menos de treinta), un puñado de votos cambia el porcentaje por completo, así que sus resultados no son confiables para este tipo de análisis</w:t>
+      </w:r>
+      <w:r>
+        <w:rPr>
+          <w:lang w:val="es-ES"/>
+        </w:rPr>
+        <w:t>, por lo que l</w:t>
+      </w:r>
+      <w:r>
+        <w:rPr>
+          <w:lang w:val="es-ES"/>
+        </w:rPr>
+        <w:t>os marqué y los traté aparte para que no contaminaran los hallazgos</w:t>
+      </w:r>
+      <w:r>
+        <w:rPr>
+          <w:lang w:val="es-ES"/>
+        </w:rPr>
+        <w:t>,</w:t>
+      </w:r>
+      <w:r>
+        <w:rPr>
+          <w:lang w:val="es-ES"/>
+        </w:rPr>
+        <w:t xml:space="preserve"> ni aparecieran como falsas alarmas en el mapa de residuos.</w:t>
+      </w:r>
+    </w:p>
+    <w:p>
+      <w:pPr>
+        <w:spacing w:after="160" w:line="276" w:lineRule="auto"/>
+        <w:jc w:val="both"/>
+        <w:rPr>
+          <w:lang w:val="es-ES"/>
+        </w:rPr>
+      </w:pPr>
+      <w:r>
+        <w:rPr>
+          <w:lang w:val="es-ES"/>
+        </w:rPr>
+        <w:t xml:space="preserve">En cuanto a lo que vendría después, la continuación más natural es clara. Colombia tuvo elecciones presidenciales en 2026, y aunque la votación ocurrió a mitad de año, sus datos </w:t>
       </w:r>
       <w:r>
         <w:rPr>
           <w:lang w:val="es-ES"/>
         </w:rPr>
         <w:lastRenderedPageBreak/>
-        <w:t xml:space="preserve">de cargar un modelo pesado cada vez que alguien la abre. En </w:t>
-      </w:r>
-      <w:r>
-        <w:rPr>
-          <w:lang w:val="es-ES"/>
-        </w:rPr>
-        <w:t>otras palabras</w:t>
-      </w:r>
-      <w:r>
-        <w:rPr>
-          <w:lang w:val="es-ES"/>
-        </w:rPr>
-        <w:t xml:space="preserve">, es la forma más directa de tomar todo lo que encontré y ponerlo </w:t>
-      </w:r>
-      <w:r>
-        <w:rPr>
-          <w:lang w:val="es-ES"/>
-        </w:rPr>
-        <w:t xml:space="preserve">de forma visual fácilmente </w:t>
-      </w:r>
-      <w:r>
-        <w:rPr>
-          <w:lang w:val="es-ES"/>
-        </w:rPr>
-        <w:t>interpretable</w:t>
-      </w:r>
-      <w:r>
-        <w:rPr>
-          <w:lang w:val="es-ES"/>
-        </w:rPr>
-        <w:t xml:space="preserve"> para que cualquier usuario que no conozca mucho del contexto del proyecto, pueda </w:t>
-      </w:r>
-      <w:r>
-        <w:rPr>
-          <w:lang w:val="es-ES"/>
-        </w:rPr>
-        <w:t>explorarlo</w:t>
-      </w:r>
-      <w:r>
-        <w:rPr>
-          <w:lang w:val="es-ES"/>
-        </w:rPr>
-        <w:t xml:space="preserve"> y entenderlo</w:t>
-      </w:r>
-      <w:r>
-        <w:rPr>
-          <w:lang w:val="es-ES"/>
-        </w:rPr>
-        <w:t>.</w:t>
+        <w:t>consolidados a nivel municipal solo se publicaron muy recientemente, con este trabajo ya muy avanzado. Incorporarlas sería la mejor forma de poner a prueba lo que encontré aquí: con una elección completamente nueva</w:t>
+      </w:r>
+      <w:r>
+        <w:rPr>
+          <w:lang w:val="es-ES"/>
+        </w:rPr>
+        <w:t xml:space="preserve"> </w:t>
+      </w:r>
+      <w:r>
+        <w:rPr>
+          <w:lang w:val="es-ES"/>
+        </w:rPr>
+        <w:t>que el modelo no vio nunca</w:t>
+      </w:r>
+      <w:r>
+        <w:rPr>
+          <w:lang w:val="es-ES"/>
+        </w:rPr>
+        <w:t>, donde a pesar de que ha ganado la derecha, el margen ha sido muy pequeño</w:t>
+      </w:r>
+      <w:r>
+        <w:rPr>
+          <w:lang w:val="es-ES"/>
+        </w:rPr>
+        <w:t xml:space="preserve">, </w:t>
+      </w:r>
+      <w:r>
+        <w:rPr>
+          <w:lang w:val="es-ES"/>
+        </w:rPr>
+        <w:t>así que s</w:t>
+      </w:r>
+      <w:r>
+        <w:rPr>
+          <w:lang w:val="es-ES"/>
+        </w:rPr>
+        <w:t>e podría comprobar si los patrones se mantienen, sobre todo el peso de la inercia y la fuerza de la regionalización. Es</w:t>
+      </w:r>
+      <w:r>
+        <w:rPr>
+          <w:lang w:val="es-ES"/>
+        </w:rPr>
+        <w:t>ta</w:t>
+      </w:r>
+      <w:r>
+        <w:rPr>
+          <w:lang w:val="es-ES"/>
+        </w:rPr>
+        <w:t xml:space="preserve"> </w:t>
+      </w:r>
+      <w:r>
+        <w:rPr>
+          <w:lang w:val="es-ES"/>
+        </w:rPr>
+        <w:t xml:space="preserve">es </w:t>
+      </w:r>
+      <w:r>
+        <w:rPr>
+          <w:lang w:val="es-ES"/>
+        </w:rPr>
+        <w:t xml:space="preserve">la validación </w:t>
+      </w:r>
+      <w:r>
+        <w:rPr>
+          <w:lang w:val="es-ES"/>
+        </w:rPr>
+        <w:t>extra</w:t>
+      </w:r>
+      <w:r>
+        <w:rPr>
+          <w:lang w:val="es-ES"/>
+        </w:rPr>
+        <w:t xml:space="preserve"> que </w:t>
+      </w:r>
+      <w:r>
+        <w:rPr>
+          <w:lang w:val="es-ES"/>
+        </w:rPr>
+        <w:t xml:space="preserve">el </w:t>
+      </w:r>
+      <w:r>
+        <w:rPr>
+          <w:lang w:val="es-ES"/>
+        </w:rPr>
+        <w:t xml:space="preserve">análisis </w:t>
+      </w:r>
+      <w:r>
+        <w:rPr>
+          <w:lang w:val="es-ES"/>
+        </w:rPr>
+        <w:t xml:space="preserve">que hemos hecho </w:t>
+      </w:r>
+      <w:r>
+        <w:rPr>
+          <w:lang w:val="es-ES"/>
+        </w:rPr>
+        <w:t xml:space="preserve">necesita para ganar solidez y queda como </w:t>
+      </w:r>
+      <w:r>
+        <w:rPr>
+          <w:lang w:val="es-ES"/>
+        </w:rPr>
+        <w:t>una</w:t>
+      </w:r>
+      <w:r>
+        <w:rPr>
+          <w:lang w:val="es-ES"/>
+        </w:rPr>
+        <w:t xml:space="preserve"> línea de trabajo futuro.</w:t>
+      </w:r>
+    </w:p>
+    <w:p>
+      <w:pPr>
+        <w:spacing w:after="160" w:line="276" w:lineRule="auto"/>
+        <w:jc w:val="both"/>
+        <w:rPr>
+          <w:lang w:val="es-ES"/>
+        </w:rPr>
+      </w:pPr>
+      <w:r>
+        <w:rPr>
+          <w:lang w:val="es-ES"/>
+        </w:rPr>
+        <w:t>Más allá de 2026, hay otros caminos que valdría la pena explorar. Si algún día se publica un dato de conflicto a nivel de municipio, se podría retomar esa pregunta con mucha más precisión. También ayudaría sumar información sobre qué tan rural es cada municipio o su composición demográfica. Y quedaría pendiente mirar si los municipios vecinos se parecen entre sí más de lo que cabría esperar por azar, algo que aquí no alcancé a estudiar.</w:t>
       </w:r>
     </w:p>
     <w:sectPr>

</xml_diff>

<commit_message>
Ampliar memoria: Inclusion de conclusiones
</commit_message>
<xml_diff>
--- a/memoria/Diego_Abella_TFM_memoria.docx
+++ b/memoria/Diego_Abella_TFM_memoria.docx
@@ -248,17 +248,30 @@
         </w:rPr>
         <w:t xml:space="preserve"> </w:t>
       </w:r>
-      <w:hyperlink r:id="rId5" w:history="1">
-        <w:r>
-          <w:rPr>
-            <w:rStyle w:val="Hyperlink"/>
-            <w:i/>
-            <w:iCs/>
-            <w:lang w:val="es-ES"/>
-          </w:rPr>
-          <w:t>https://tfm-electoral-colombia-2026.streamlit.app</w:t>
-        </w:r>
-      </w:hyperlink>
+      <w:r>
+        <w:fldChar w:fldCharType="begin"/>
+      </w:r>
+      <w:r>
+        <w:rPr>
+          <w:lang w:val="es-ES"/>
+        </w:rPr>
+        <w:instrText>HYPERLINK "https://tfm-electoral-colombia-2026.streamlit.app"</w:instrText>
+      </w:r>
+      <w:r>
+        <w:fldChar w:fldCharType="separate"/>
+      </w:r>
+      <w:r>
+        <w:rPr>
+          <w:rStyle w:val="Hyperlink"/>
+          <w:i/>
+          <w:iCs/>
+          <w:lang w:val="es-ES"/>
+        </w:rPr>
+        <w:t>https://tfm-electoral-colombia-2026.streamlit.app</w:t>
+      </w:r>
+      <w:r>
+        <w:fldChar w:fldCharType="end"/>
+      </w:r>
     </w:p>
     <w:p>
       <w:pPr>
@@ -534,23 +547,36 @@
         </w:rPr>
         <w:t xml:space="preserve">disponible en </w:t>
       </w:r>
-      <w:hyperlink r:id="rId6" w:history="1">
-        <w:r>
-          <w:rPr>
-            <w:rStyle w:val="Hyperlink"/>
-            <w:lang w:val="es-ES"/>
-          </w:rPr>
-          <w:t>https://tfm-electoral-</w:t>
-        </w:r>
-        <w:r>
-          <w:rPr>
-            <w:rStyle w:val="Hyperlink"/>
-            <w:lang w:val="es-ES"/>
-          </w:rPr>
-          <w:lastRenderedPageBreak/>
-          <w:t>colombia-2026.streamlit.app</w:t>
-        </w:r>
-      </w:hyperlink>
+      <w:r>
+        <w:fldChar w:fldCharType="begin"/>
+      </w:r>
+      <w:r>
+        <w:rPr>
+          <w:lang w:val="es-ES"/>
+        </w:rPr>
+        <w:instrText>HYPERLINK "https://tfm-electoral-colombia-2026.streamlit.app"</w:instrText>
+      </w:r>
+      <w:r>
+        <w:fldChar w:fldCharType="separate"/>
+      </w:r>
+      <w:r>
+        <w:rPr>
+          <w:rStyle w:val="Hyperlink"/>
+          <w:lang w:val="es-ES"/>
+        </w:rPr>
+        <w:t>https://tfm-electoral-</w:t>
+      </w:r>
+      <w:r>
+        <w:rPr>
+          <w:rStyle w:val="Hyperlink"/>
+          <w:lang w:val="es-ES"/>
+        </w:rPr>
+        <w:lastRenderedPageBreak/>
+        <w:t>colombia-2026.streamlit.app</w:t>
+      </w:r>
+      <w:r>
+        <w:fldChar w:fldCharType="end"/>
+      </w:r>
       <w:r>
         <w:rPr>
           <w:lang w:val="es-ES"/>
@@ -644,15 +670,28 @@
         </w:rPr>
         <w:t xml:space="preserve">Por eso, además del análisis hecho, he construido una aplicación web donde cualquiera interesado puede explorar los resultados sin tener que tocar una línea de código: ver el mapa del voto por municipio y por año, revisar cómo cambia la relación entre pobreza y voto según la región, consultar un municipio concreto y ver cuáles se salieron de su tendencia histórica. La aplicación está disponible en el URL: </w:t>
       </w:r>
-      <w:hyperlink r:id="rId7" w:history="1">
-        <w:r>
-          <w:rPr>
-            <w:rStyle w:val="Hyperlink"/>
-            <w:lang w:val="es-ES"/>
-          </w:rPr>
-          <w:t>https://tfm-electoral-colombia-2026.streamlit.app</w:t>
-        </w:r>
-      </w:hyperlink>
+      <w:r>
+        <w:fldChar w:fldCharType="begin"/>
+      </w:r>
+      <w:r>
+        <w:rPr>
+          <w:lang w:val="es-ES"/>
+        </w:rPr>
+        <w:instrText>HYPERLINK "https://tfm-electoral-colombia-2026.streamlit.app"</w:instrText>
+      </w:r>
+      <w:r>
+        <w:fldChar w:fldCharType="separate"/>
+      </w:r>
+      <w:r>
+        <w:rPr>
+          <w:rStyle w:val="Hyperlink"/>
+          <w:lang w:val="es-ES"/>
+        </w:rPr>
+        <w:t>https://tfm-electoral-colombia-2026.streamlit.app</w:t>
+      </w:r>
+      <w:r>
+        <w:fldChar w:fldCharType="end"/>
+      </w:r>
       <w:r>
         <w:rPr>
           <w:lang w:val="es-ES"/>
@@ -2229,7 +2268,7 @@
                     <pic:cNvPicPr/>
                   </pic:nvPicPr>
                   <pic:blipFill>
-                    <a:blip r:embed="rId8"/>
+                    <a:blip r:embed="rId5"/>
                     <a:stretch>
                       <a:fillRect/>
                     </a:stretch>
@@ -2550,7 +2589,7 @@
                     <pic:cNvPicPr/>
                   </pic:nvPicPr>
                   <pic:blipFill>
-                    <a:blip r:embed="rId9"/>
+                    <a:blip r:embed="rId6"/>
                     <a:stretch>
                       <a:fillRect/>
                     </a:stretch>
@@ -2647,7 +2686,7 @@
                     <pic:cNvPicPr/>
                   </pic:nvPicPr>
                   <pic:blipFill>
-                    <a:blip r:embed="rId10"/>
+                    <a:blip r:embed="rId7"/>
                     <a:stretch>
                       <a:fillRect/>
                     </a:stretch>
@@ -2795,7 +2834,7 @@
                     <pic:cNvPicPr/>
                   </pic:nvPicPr>
                   <pic:blipFill>
-                    <a:blip r:embed="rId11"/>
+                    <a:blip r:embed="rId8"/>
                     <a:stretch>
                       <a:fillRect/>
                     </a:stretch>
@@ -3083,7 +3122,7 @@
           <w:lang w:val="es-ES"/>
         </w:rPr>
       </w:pPr>
-      <w:hyperlink r:id="rId12" w:history="1">
+      <w:hyperlink r:id="rId9" w:history="1">
         <w:r>
           <w:rPr>
             <w:rStyle w:val="Hyperlink"/>
@@ -3348,8 +3387,7 @@
       </w:pPr>
       <w:r>
         <w:rPr>
-          <w:rFonts w:ascii="Arial" w:hAnsi="Arial"/>
-          <w:sz w:val="22"/>
+          <w:lang w:val="es-ES"/>
         </w:rPr>
         <w:t>Estas son las principales limitantes que he identificado mientras realizaba este trabajo:</w:t>
       </w:r>
@@ -3473,7 +3511,7 @@
         <w:rPr>
           <w:lang w:val="es-ES"/>
         </w:rPr>
-        <w:t xml:space="preserve"> sobre todo en aquellos donde hay sospecha de que hay cohesión electoral</w:t>
+        <w:t xml:space="preserve"> sobre todo en aquellos donde hay sospecha de que hay coacción electoral</w:t>
       </w:r>
       <w:r>
         <w:rPr>
@@ -3516,16 +3554,14 @@
       </w:pPr>
       <w:r>
         <w:rPr>
-          <w:rFonts w:ascii="Arial" w:hAnsi="Arial"/>
           <w:b/>
-          <w:sz w:val="22"/>
+          <w:lang w:val="es-ES"/>
         </w:rPr>
         <w:t>La pobreza se mide con censos, que no son anuales.</w:t>
       </w:r>
       <w:r>
         <w:rPr>
-          <w:rFonts w:ascii="Arial" w:hAnsi="Arial"/>
-          <w:sz w:val="22"/>
+          <w:lang w:val="es-ES"/>
         </w:rPr>
         <w:t xml:space="preserve"> El NBI (Índice de Necesidades Básicas Insatisfechas) viene de los censos nacionales de 2005 y 2018, así que para varias elecciones uso el dato censal más cercano, no el del año exacto. La pobreza estructural cambia despacio, así que la aproximación es razonable, pero no deja de ser una aproximación.</w:t>
       </w:r>
@@ -3913,6 +3949,136 @@
         </w:rPr>
         <w:t>Más allá de 2026, hay otros caminos que valdría la pena explorar. Si algún día se publica un dato de conflicto a nivel de municipio, se podría retomar esa pregunta con mucha más precisión. También ayudaría sumar información sobre qué tan rural es cada municipio o su composición demográfica. Y quedaría pendiente mirar si los municipios vecinos se parecen entre sí más de lo que cabría esperar por azar, algo que aquí no alcancé a estudiar.</w:t>
       </w:r>
+    </w:p>
+    <w:p>
+      <w:pPr>
+        <w:pStyle w:val="Heading1"/>
+        <w:spacing w:before="240" w:after="160"/>
+        <w:rPr>
+          <w:lang w:val="es-ES"/>
+        </w:rPr>
+      </w:pPr>
+      <w:r>
+        <w:rPr>
+          <w:lang w:val="es-ES"/>
+        </w:rPr>
+        <w:t>Conclusiones</w:t>
+      </w:r>
+    </w:p>
+    <w:p>
+      <w:pPr>
+        <w:spacing w:after="160" w:line="276" w:lineRule="auto"/>
+        <w:jc w:val="both"/>
+        <w:rPr>
+          <w:lang w:val="es-ES"/>
+        </w:rPr>
+      </w:pPr>
+      <w:r>
+        <w:rPr>
+          <w:lang w:val="es-ES"/>
+        </w:rPr>
+        <w:t>Empecé este trabajo queriendo detectar posibles señales de coacción electoral en las zonas de conflicto de Colombia que es lo que los medios y redes sociales sugieren, y terminé con algo distinto que en mi opinión es aún más sólido: una explicación de qué estructura de verdad el voto de izquierda en el país y qué no. Ese giro no fue un desvío, sino que fue el resultado principal. Los datos me llevaron a donde tenían que llevarme, no a donde yo quería llegar. Lo que aprendí se puede resumir en pocas ideas, todas con consecuencias para quien quiera entender cómo se comporta el mapa electoral colombiano.</w:t>
+      </w:r>
+    </w:p>
+    <w:p>
+      <w:pPr>
+        <w:spacing w:after="160" w:line="276" w:lineRule="auto"/>
+        <w:jc w:val="both"/>
+        <w:rPr>
+          <w:lang w:val="es-ES"/>
+        </w:rPr>
+      </w:pPr>
+      <w:r>
+        <w:rPr>
+          <w:lang w:val="es-ES"/>
+        </w:rPr>
+        <w:t>La primera es que el pasado manda. Un municipio vota, sobre todo, como ya venía votando. Esa inercia pesa más que cualquier otra cosa que medí y ningún modelo por avanzado que fuera logró mejorarla de forma clara. Para quien analiza las elecciones en Colombia, esto significa que la historia de cada territorio es el punto de partida obligado, ya que el voto no se explica bien sin mirar de dónde viene.</w:t>
+      </w:r>
+    </w:p>
+    <w:p>
+      <w:pPr>
+        <w:spacing w:after="160" w:line="276" w:lineRule="auto"/>
+        <w:jc w:val="both"/>
+        <w:rPr>
+          <w:lang w:val="es-ES"/>
+        </w:rPr>
+      </w:pPr>
+      <w:r>
+        <w:rPr>
+          <w:lang w:val="es-ES"/>
+        </w:rPr>
+        <w:t>La segunda es que las explicaciones fáciles a nivel nacional pueden engañar. La idea de que "los más pobres votan a la izquierda" es falsa si se mira todo el país junto, pero no porque la pobreza no tenga importancia, sino porque su efecto va en direcciones opuestas según la región que se esté evaluando. En unas partes la pobreza empuja el voto hacia un lado y en otras hacia el lado opuesto y si se saca un promedio nacional, se esconden las dos señales. La lección aprendida es que en Colombia hay que desconfiar de los promedios del país y bajar siempre al territorio.</w:t>
+      </w:r>
+    </w:p>
+    <w:p>
+      <w:pPr>
+        <w:spacing w:after="160" w:line="276" w:lineRule="auto"/>
+        <w:jc w:val="both"/>
+        <w:rPr>
+          <w:lang w:val="es-ES"/>
+        </w:rPr>
+      </w:pPr>
+      <w:r>
+        <w:rPr>
+          <w:lang w:val="es-ES"/>
+        </w:rPr>
+        <w:t>La tercera es que entre la pobreza y la región, es la región la que hace casi todo el trabajo para explicar el voto: de todo lo que esas dos variables capturan juntas, la geografía explica entre el 96% y el 99% en cuatro de los cinco años analizados (2014 es la excepción) y donde la pobreza apenas es una fracción mínima. Y esto lleva a la consecuencia que más me sorprendió: básicamente los municipios con más conflicto sí aparecían votando más a la izquierda, pero solo en las elecciones más recientes. Cuando se tiene en cuenta la región y la pobreza, el conflicto deja de aportar nada por sí mismo. Lo que a simple vista parecía un efecto del conflicto era en realidad un producto de la geografía y la pobreza. No puedo afirmar que el conflicto no influya en la vida política de esas regiones (eso este trabajo no lo puede decir), pero sí que con los datos analizados en este trabajo, no se distingue ninguna influencia.</w:t>
+      </w:r>
+    </w:p>
+    <w:p>
+      <w:pPr>
+        <w:spacing w:after="160" w:line="276" w:lineRule="auto"/>
+        <w:jc w:val="both"/>
+        <w:rPr>
+          <w:lang w:val="es-ES"/>
+        </w:rPr>
+      </w:pPr>
+      <w:r>
+        <w:rPr>
+          <w:lang w:val="es-ES"/>
+        </w:rPr>
+        <w:lastRenderedPageBreak/>
+        <w:t>Puestas juntas, estas conclusiones dibujan un electorado donde manda primero la inercia electoral, donde el voto de ayer es el mejor predictor del de mañana y luego la geografía, muy por encima de la pobreza. Es una imagen menos intuitiva que la del relato habitual, pero es la que sostienen los datos analizados.</w:t>
+      </w:r>
+    </w:p>
+    <w:p>
+      <w:pPr>
+        <w:spacing w:after="160" w:line="276" w:lineRule="auto"/>
+        <w:jc w:val="both"/>
+        <w:rPr>
+          <w:lang w:val="es-ES"/>
+        </w:rPr>
+      </w:pPr>
+      <w:r>
+        <w:rPr>
+          <w:lang w:val="es-ES"/>
+        </w:rPr>
+        <w:t>Este trabajo no termina en el análisis. Todo lo que encontré quedó volcado en una aplicación web pública, para que cualquier persona pueda explorar el mapa del voto por su cuenta y comprobar estas ideas municipio a municipio, sin depender de mis conclusiones.</w:t>
+      </w:r>
+    </w:p>
+    <w:p>
+      <w:pPr>
+        <w:spacing w:after="160" w:line="276" w:lineRule="auto"/>
+        <w:jc w:val="both"/>
+        <w:rPr>
+          <w:lang w:val="es-ES"/>
+        </w:rPr>
+      </w:pPr>
+      <w:r>
+        <w:rPr>
+          <w:lang w:val="es-ES"/>
+        </w:rPr>
+        <w:t>Más allá de los hallazgos, me llevo una lección sobre la forma de trabajar este tipo de proyectos de análisis de datos y es que la parte más valiosa del proyecto no fue confirmar una hipótesis, sino ponerla a prueba con honestidad y aceptar que no se sostenía. Aprendí que cuando un resultado negativo está bien fundamentado, enseña tanto como uno positivo y que la disciplina de no afirmar más de lo que los datos permiten, es lo que separa un análisis serio, de una opinión disfrazada de números.</w:t>
+      </w:r>
+    </w:p>
+    <w:p>
+      <w:pPr>
+        <w:spacing w:after="160" w:line="276" w:lineRule="auto"/>
+        <w:jc w:val="both"/>
+        <w:rPr>
+          <w:lang w:val="es-ES"/>
+        </w:rPr>
+      </w:pPr>
     </w:p>
     <w:sectPr>
       <w:pgSz w:w="11906" w:h="16838"/>

</xml_diff>

<commit_message>
Completar cuerpo de la memoria con conclusiones y bibliografía
</commit_message>
<xml_diff>
--- a/memoria/Diego_Abella_TFM_memoria.docx
+++ b/memoria/Diego_Abella_TFM_memoria.docx
@@ -248,30 +248,17 @@
         </w:rPr>
         <w:t xml:space="preserve"> </w:t>
       </w:r>
-      <w:r>
-        <w:fldChar w:fldCharType="begin"/>
-      </w:r>
-      <w:r>
-        <w:rPr>
-          <w:lang w:val="es-ES"/>
-        </w:rPr>
-        <w:instrText>HYPERLINK "https://tfm-electoral-colombia-2026.streamlit.app"</w:instrText>
-      </w:r>
-      <w:r>
-        <w:fldChar w:fldCharType="separate"/>
-      </w:r>
-      <w:r>
-        <w:rPr>
-          <w:rStyle w:val="Hyperlink"/>
-          <w:i/>
-          <w:iCs/>
-          <w:lang w:val="es-ES"/>
-        </w:rPr>
-        <w:t>https://tfm-electoral-colombia-2026.streamlit.app</w:t>
-      </w:r>
-      <w:r>
-        <w:fldChar w:fldCharType="end"/>
-      </w:r>
+      <w:hyperlink r:id="rId5" w:history="1">
+        <w:r>
+          <w:rPr>
+            <w:rStyle w:val="Hyperlink"/>
+            <w:i/>
+            <w:iCs/>
+            <w:lang w:val="es-ES"/>
+          </w:rPr>
+          <w:t>https://tfm-electoral-colombia-2026.streamlit.app</w:t>
+        </w:r>
+      </w:hyperlink>
     </w:p>
     <w:p>
       <w:pPr>
@@ -547,36 +534,23 @@
         </w:rPr>
         <w:t xml:space="preserve">disponible en </w:t>
       </w:r>
-      <w:r>
-        <w:fldChar w:fldCharType="begin"/>
-      </w:r>
-      <w:r>
-        <w:rPr>
-          <w:lang w:val="es-ES"/>
-        </w:rPr>
-        <w:instrText>HYPERLINK "https://tfm-electoral-colombia-2026.streamlit.app"</w:instrText>
-      </w:r>
-      <w:r>
-        <w:fldChar w:fldCharType="separate"/>
-      </w:r>
-      <w:r>
-        <w:rPr>
-          <w:rStyle w:val="Hyperlink"/>
-          <w:lang w:val="es-ES"/>
-        </w:rPr>
-        <w:t>https://tfm-electoral-</w:t>
-      </w:r>
-      <w:r>
-        <w:rPr>
-          <w:rStyle w:val="Hyperlink"/>
-          <w:lang w:val="es-ES"/>
-        </w:rPr>
-        <w:lastRenderedPageBreak/>
-        <w:t>colombia-2026.streamlit.app</w:t>
-      </w:r>
-      <w:r>
-        <w:fldChar w:fldCharType="end"/>
-      </w:r>
+      <w:hyperlink r:id="rId6" w:history="1">
+        <w:r>
+          <w:rPr>
+            <w:rStyle w:val="Hyperlink"/>
+            <w:lang w:val="es-ES"/>
+          </w:rPr>
+          <w:t>https://tfm-electoral-</w:t>
+        </w:r>
+        <w:r>
+          <w:rPr>
+            <w:rStyle w:val="Hyperlink"/>
+            <w:lang w:val="es-ES"/>
+          </w:rPr>
+          <w:lastRenderedPageBreak/>
+          <w:t>colombia-2026.streamlit.app</w:t>
+        </w:r>
+      </w:hyperlink>
       <w:r>
         <w:rPr>
           <w:lang w:val="es-ES"/>
@@ -670,28 +644,15 @@
         </w:rPr>
         <w:t xml:space="preserve">Por eso, además del análisis hecho, he construido una aplicación web donde cualquiera interesado puede explorar los resultados sin tener que tocar una línea de código: ver el mapa del voto por municipio y por año, revisar cómo cambia la relación entre pobreza y voto según la región, consultar un municipio concreto y ver cuáles se salieron de su tendencia histórica. La aplicación está disponible en el URL: </w:t>
       </w:r>
-      <w:r>
-        <w:fldChar w:fldCharType="begin"/>
-      </w:r>
-      <w:r>
-        <w:rPr>
-          <w:lang w:val="es-ES"/>
-        </w:rPr>
-        <w:instrText>HYPERLINK "https://tfm-electoral-colombia-2026.streamlit.app"</w:instrText>
-      </w:r>
-      <w:r>
-        <w:fldChar w:fldCharType="separate"/>
-      </w:r>
-      <w:r>
-        <w:rPr>
-          <w:rStyle w:val="Hyperlink"/>
-          <w:lang w:val="es-ES"/>
-        </w:rPr>
-        <w:t>https://tfm-electoral-colombia-2026.streamlit.app</w:t>
-      </w:r>
-      <w:r>
-        <w:fldChar w:fldCharType="end"/>
-      </w:r>
+      <w:hyperlink r:id="rId7" w:history="1">
+        <w:r>
+          <w:rPr>
+            <w:rStyle w:val="Hyperlink"/>
+            <w:lang w:val="es-ES"/>
+          </w:rPr>
+          <w:t>https://tfm-electoral-colombia-2026.streamlit.app</w:t>
+        </w:r>
+      </w:hyperlink>
       <w:r>
         <w:rPr>
           <w:lang w:val="es-ES"/>
@@ -2268,7 +2229,7 @@
                     <pic:cNvPicPr/>
                   </pic:nvPicPr>
                   <pic:blipFill>
-                    <a:blip r:embed="rId5"/>
+                    <a:blip r:embed="rId8"/>
                     <a:stretch>
                       <a:fillRect/>
                     </a:stretch>
@@ -2589,7 +2550,7 @@
                     <pic:cNvPicPr/>
                   </pic:nvPicPr>
                   <pic:blipFill>
-                    <a:blip r:embed="rId6"/>
+                    <a:blip r:embed="rId9"/>
                     <a:stretch>
                       <a:fillRect/>
                     </a:stretch>
@@ -2686,7 +2647,7 @@
                     <pic:cNvPicPr/>
                   </pic:nvPicPr>
                   <pic:blipFill>
-                    <a:blip r:embed="rId7"/>
+                    <a:blip r:embed="rId10"/>
                     <a:stretch>
                       <a:fillRect/>
                     </a:stretch>
@@ -2834,7 +2795,7 @@
                     <pic:cNvPicPr/>
                   </pic:nvPicPr>
                   <pic:blipFill>
-                    <a:blip r:embed="rId8"/>
+                    <a:blip r:embed="rId11"/>
                     <a:stretch>
                       <a:fillRect/>
                     </a:stretch>
@@ -3122,7 +3083,7 @@
           <w:lang w:val="es-ES"/>
         </w:rPr>
       </w:pPr>
-      <w:hyperlink r:id="rId9" w:history="1">
+      <w:hyperlink r:id="rId12" w:history="1">
         <w:r>
           <w:rPr>
             <w:rStyle w:val="Hyperlink"/>
@@ -3387,7 +3348,8 @@
       </w:pPr>
       <w:r>
         <w:rPr>
-          <w:lang w:val="es-ES"/>
+          <w:rFonts w:ascii="Arial" w:hAnsi="Arial"/>
+          <w:sz w:val="22"/>
         </w:rPr>
         <w:t>Estas son las principales limitantes que he identificado mientras realizaba este trabajo:</w:t>
       </w:r>
@@ -3554,14 +3516,16 @@
       </w:pPr>
       <w:r>
         <w:rPr>
+          <w:rFonts w:ascii="Arial" w:hAnsi="Arial"/>
           <w:b/>
-          <w:lang w:val="es-ES"/>
+          <w:sz w:val="22"/>
         </w:rPr>
         <w:t>La pobreza se mide con censos, que no son anuales.</w:t>
       </w:r>
       <w:r>
         <w:rPr>
-          <w:lang w:val="es-ES"/>
+          <w:rFonts w:ascii="Arial" w:hAnsi="Arial"/>
+          <w:sz w:val="22"/>
         </w:rPr>
         <w:t xml:space="preserve"> El NBI (Índice de Necesidades Básicas Insatisfechas) viene de los censos nacionales de 2005 y 2018, así que para varias elecciones uso el dato censal más cercano, no el del año exacto. La pobreza estructural cambia despacio, así que la aproximación es razonable, pero no deja de ser una aproximación.</w:t>
       </w:r>
@@ -3959,9 +3923,6 @@
         </w:rPr>
       </w:pPr>
       <w:r>
-        <w:rPr>
-          <w:lang w:val="es-ES"/>
-        </w:rPr>
         <w:t>Conclusiones</w:t>
       </w:r>
     </w:p>
@@ -3975,7 +3936,8 @@
       </w:pPr>
       <w:r>
         <w:rPr>
-          <w:lang w:val="es-ES"/>
+          <w:rFonts w:ascii="Arial" w:hAnsi="Arial"/>
+          <w:sz w:val="22"/>
         </w:rPr>
         <w:t>Empecé este trabajo queriendo detectar posibles señales de coacción electoral en las zonas de conflicto de Colombia que es lo que los medios y redes sociales sugieren, y terminé con algo distinto que en mi opinión es aún más sólido: una explicación de qué estructura de verdad el voto de izquierda en el país y qué no. Ese giro no fue un desvío, sino que fue el resultado principal. Los datos me llevaron a donde tenían que llevarme, no a donde yo quería llegar. Lo que aprendí se puede resumir en pocas ideas, todas con consecuencias para quien quiera entender cómo se comporta el mapa electoral colombiano.</w:t>
       </w:r>
@@ -3990,7 +3952,8 @@
       </w:pPr>
       <w:r>
         <w:rPr>
-          <w:lang w:val="es-ES"/>
+          <w:rFonts w:ascii="Arial" w:hAnsi="Arial"/>
+          <w:sz w:val="22"/>
         </w:rPr>
         <w:t>La primera es que el pasado manda. Un municipio vota, sobre todo, como ya venía votando. Esa inercia pesa más que cualquier otra cosa que medí y ningún modelo por avanzado que fuera logró mejorarla de forma clara. Para quien analiza las elecciones en Colombia, esto significa que la historia de cada territorio es el punto de partida obligado, ya que el voto no se explica bien sin mirar de dónde viene.</w:t>
       </w:r>
@@ -4005,7 +3968,8 @@
       </w:pPr>
       <w:r>
         <w:rPr>
-          <w:lang w:val="es-ES"/>
+          <w:rFonts w:ascii="Arial" w:hAnsi="Arial"/>
+          <w:sz w:val="22"/>
         </w:rPr>
         <w:t>La segunda es que las explicaciones fáciles a nivel nacional pueden engañar. La idea de que "los más pobres votan a la izquierda" es falsa si se mira todo el país junto, pero no porque la pobreza no tenga importancia, sino porque su efecto va en direcciones opuestas según la región que se esté evaluando. En unas partes la pobreza empuja el voto hacia un lado y en otras hacia el lado opuesto y si se saca un promedio nacional, se esconden las dos señales. La lección aprendida es que en Colombia hay que desconfiar de los promedios del país y bajar siempre al territorio.</w:t>
       </w:r>
@@ -4020,7 +3984,8 @@
       </w:pPr>
       <w:r>
         <w:rPr>
-          <w:lang w:val="es-ES"/>
+          <w:rFonts w:ascii="Arial" w:hAnsi="Arial"/>
+          <w:sz w:val="22"/>
         </w:rPr>
         <w:t>La tercera es que entre la pobreza y la región, es la región la que hace casi todo el trabajo para explicar el voto: de todo lo que esas dos variables capturan juntas, la geografía explica entre el 96% y el 99% en cuatro de los cinco años analizados (2014 es la excepción) y donde la pobreza apenas es una fracción mínima. Y esto lleva a la consecuencia que más me sorprendió: básicamente los municipios con más conflicto sí aparecían votando más a la izquierda, pero solo en las elecciones más recientes. Cuando se tiene en cuenta la región y la pobreza, el conflicto deja de aportar nada por sí mismo. Lo que a simple vista parecía un efecto del conflicto era en realidad un producto de la geografía y la pobreza. No puedo afirmar que el conflicto no influya en la vida política de esas regiones (eso este trabajo no lo puede decir), pero sí que con los datos analizados en este trabajo, no se distingue ninguna influencia.</w:t>
       </w:r>
@@ -4035,9 +4000,9 @@
       </w:pPr>
       <w:r>
         <w:rPr>
-          <w:lang w:val="es-ES"/>
-        </w:rPr>
-        <w:lastRenderedPageBreak/>
+          <w:rFonts w:ascii="Arial" w:hAnsi="Arial"/>
+          <w:sz w:val="22"/>
+        </w:rPr>
         <w:t>Puestas juntas, estas conclusiones dibujan un electorado donde manda primero la inercia electoral, donde el voto de ayer es el mejor predictor del de mañana y luego la geografía, muy por encima de la pobreza. Es una imagen menos intuitiva que la del relato habitual, pero es la que sostienen los datos analizados.</w:t>
       </w:r>
     </w:p>
@@ -4051,7 +4016,8 @@
       </w:pPr>
       <w:r>
         <w:rPr>
-          <w:lang w:val="es-ES"/>
+          <w:rFonts w:ascii="Arial" w:hAnsi="Arial"/>
+          <w:sz w:val="22"/>
         </w:rPr>
         <w:t>Este trabajo no termina en el análisis. Todo lo que encontré quedó volcado en una aplicación web pública, para que cualquier persona pueda explorar el mapa del voto por su cuenta y comprobar estas ideas municipio a municipio, sin depender de mis conclusiones.</w:t>
       </w:r>
@@ -4066,19 +4032,169 @@
       </w:pPr>
       <w:r>
         <w:rPr>
-          <w:lang w:val="es-ES"/>
+          <w:rFonts w:ascii="Arial" w:hAnsi="Arial"/>
+          <w:sz w:val="22"/>
         </w:rPr>
         <w:t>Más allá de los hallazgos, me llevo una lección sobre la forma de trabajar este tipo de proyectos de análisis de datos y es que la parte más valiosa del proyecto no fue confirmar una hipótesis, sino ponerla a prueba con honestidad y aceptar que no se sostenía. Aprendí que cuando un resultado negativo está bien fundamentado, enseña tanto como uno positivo y que la disciplina de no afirmar más de lo que los datos permiten, es lo que separa un análisis serio, de una opinión disfrazada de números.</w:t>
       </w:r>
     </w:p>
     <w:p>
       <w:pPr>
-        <w:spacing w:after="160" w:line="276" w:lineRule="auto"/>
-        <w:jc w:val="both"/>
-        <w:rPr>
-          <w:lang w:val="es-ES"/>
-        </w:rPr>
-      </w:pPr>
+        <w:pStyle w:val="Heading1"/>
+        <w:spacing w:before="240" w:after="160"/>
+        <w:rPr>
+          <w:lang w:val="es-ES"/>
+        </w:rPr>
+      </w:pPr>
+      <w:r>
+        <w:t>Bibliografía</w:t>
+      </w:r>
+    </w:p>
+    <w:p>
+      <w:pPr>
+        <w:spacing w:after="160" w:line="276" w:lineRule="auto"/>
+        <w:jc w:val="left"/>
+        <w:rPr>
+          <w:lang w:val="es-ES"/>
+        </w:rPr>
+      </w:pPr>
+      <w:r>
+        <w:rPr>
+          <w:rFonts w:ascii="Arial" w:hAnsi="Arial"/>
+          <w:b/>
+          <w:sz w:val="22"/>
+        </w:rPr>
+        <w:t>Fuentes de datos</w:t>
+      </w:r>
+    </w:p>
+    <w:p>
+      <w:pPr>
+        <w:spacing w:after="160" w:line="276" w:lineRule="auto"/>
+        <w:jc w:val="left"/>
+        <w:rPr>
+          <w:lang w:val="es-ES"/>
+        </w:rPr>
+      </w:pPr>
+      <w:r>
+        <w:rPr>
+          <w:rFonts w:ascii="Arial" w:hAnsi="Arial"/>
+          <w:sz w:val="20"/>
+        </w:rPr>
+        <w:t>Registraduría Nacional del Estado Civil. Resultados electorales presidenciales 1998–2018. https://cedae.registraduria.gov.co/datos-para-la-democracia/resultados-electorales/descarga-datos</w:t>
+      </w:r>
+    </w:p>
+    <w:p>
+      <w:pPr>
+        <w:spacing w:after="160" w:line="276" w:lineRule="auto"/>
+        <w:jc w:val="left"/>
+        <w:rPr>
+          <w:lang w:val="es-ES"/>
+        </w:rPr>
+      </w:pPr>
+      <w:r>
+        <w:rPr>
+          <w:rFonts w:ascii="Arial" w:hAnsi="Arial"/>
+          <w:sz w:val="20"/>
+        </w:rPr>
+        <w:t>Registraduría Nacional del Estado Civil. Resultados electorales presidenciales 2022. https://observatorio.registraduria.gov.co/views/electoral/historicos-resultados.php</w:t>
+      </w:r>
+    </w:p>
+    <w:p>
+      <w:pPr>
+        <w:spacing w:after="160" w:line="276" w:lineRule="auto"/>
+        <w:jc w:val="left"/>
+        <w:rPr>
+          <w:lang w:val="es-ES"/>
+        </w:rPr>
+      </w:pPr>
+      <w:r>
+        <w:rPr>
+          <w:rFonts w:ascii="Arial" w:hAnsi="Arial"/>
+          <w:sz w:val="20"/>
+        </w:rPr>
+        <w:t>Unidad para la Atención y Reparación Integral a las Víctimas (UARIV). Víctimas del conflicto armado por año y departamento. Portal de Datos Abiertos del Gobierno de Colombia. https://www.datos.gov.co/Inclusi-n-Social-y-Reconciliaci-n/VICTIMAS-POR-A-OS-DEPARTAMENTAL/jurc-ck3a/about_data</w:t>
+      </w:r>
+    </w:p>
+    <w:p>
+      <w:pPr>
+        <w:spacing w:after="160" w:line="276" w:lineRule="auto"/>
+        <w:jc w:val="left"/>
+        <w:rPr>
+          <w:lang w:val="es-ES"/>
+        </w:rPr>
+      </w:pPr>
+      <w:r>
+        <w:rPr>
+          <w:rFonts w:ascii="Arial" w:hAnsi="Arial"/>
+          <w:sz w:val="20"/>
+        </w:rPr>
+        <w:t>Departamento Administrativo Nacional de Estadística (DANE). Necesidades Básicas Insatisfechas (NBI), Censo Nacional de Población y Vivienda 2018. https://www.dane.gov.co/files/censo2018/informacion-tecnica/CNPV-2018-NBI.xlsx</w:t>
+      </w:r>
+    </w:p>
+    <w:p>
+      <w:pPr>
+        <w:spacing w:after="160" w:line="276" w:lineRule="auto"/>
+        <w:jc w:val="left"/>
+        <w:rPr>
+          <w:lang w:val="es-ES"/>
+        </w:rPr>
+      </w:pPr>
+      <w:r>
+        <w:rPr>
+          <w:rFonts w:ascii="Arial" w:hAnsi="Arial"/>
+          <w:sz w:val="20"/>
+        </w:rPr>
+        <w:t>Departamento Administrativo Nacional de Estadística (DANE). Necesidades Básicas Insatisfechas (NBI), Censo General 2005. https://www.dane.gov.co/files/censos/resultados/NBI_total_dpto_30_Jun_2012.xls</w:t>
+      </w:r>
+    </w:p>
+    <w:p>
+      <w:pPr>
+        <w:spacing w:after="160" w:line="276" w:lineRule="auto"/>
+        <w:jc w:val="left"/>
+        <w:rPr>
+          <w:lang w:val="es-ES"/>
+        </w:rPr>
+      </w:pPr>
+      <w:r>
+        <w:rPr>
+          <w:rFonts w:ascii="Arial" w:hAnsi="Arial"/>
+          <w:sz w:val="20"/>
+        </w:rPr>
+        <w:t>Departamento Administrativo Nacional de Estadística (DANE). Índice de Pobreza Multidimensional (IPM) departamental, 2022. https://www.dane.gov.co/files/investigaciones/condiciones_vida/pobreza/2022/anexo_dptal_pobreza_multidimensional_2022.xlsx</w:t>
+      </w:r>
+    </w:p>
+    <w:p>
+      <w:pPr>
+        <w:spacing w:after="160" w:line="276" w:lineRule="auto"/>
+        <w:jc w:val="left"/>
+        <w:rPr>
+          <w:lang w:val="es-ES"/>
+        </w:rPr>
+      </w:pPr>
+      <w:r>
+        <w:rPr>
+          <w:rFonts w:ascii="Arial" w:hAnsi="Arial"/>
+          <w:b/>
+          <w:sz w:val="22"/>
+        </w:rPr>
+        <w:t>Herramientas</w:t>
+      </w:r>
+    </w:p>
+    <w:p>
+      <w:pPr>
+        <w:spacing w:after="160" w:line="276" w:lineRule="auto"/>
+        <w:jc w:val="left"/>
+        <w:rPr>
+          <w:lang w:val="es-ES"/>
+        </w:rPr>
+      </w:pPr>
+      <w:r>
+        <w:rPr>
+          <w:rFonts w:ascii="Arial" w:hAnsi="Arial"/>
+          <w:sz w:val="20"/>
+        </w:rPr>
+        <w:t>El proyecto se desarrolló íntegramente en Python, con las librerías pandas, scikit-learn, XGBoost, GeoPandas y Streamlit. El código completo está disponible en el repositorio público del proyecto: https://github.com/usbdiego7777-ui/tfm-electoral-colombia</w:t>
+      </w:r>
     </w:p>
     <w:sectPr>
       <w:pgSz w:w="11906" w:h="16838"/>

</xml_diff>